<commit_message>
Link ADIE Lab to educatian.github.io/adie and make the button prominent
Point labWebsite at the GitHub Pages lab site (was adielab.ua.edu) across site-data, app.js fallback, JSON-LD sameAs, and the source docx contact field. Render the hero lab action first as a standout gradient button with a flask icon ("Visit the ADIE Lab").

Co-Authored-By: Claude Opus 4.8 (1M context) <noreply@anthropic.com>
</commit_message>
<xml_diff>
--- a/assets/CV_202604_MOON.docx
+++ b/assets/CV_202604_MOON.docx
@@ -331,14 +331,18 @@
           <w:szCs w:val="22"/>
         </w:rPr>
         <w:t>ResearchGate:</w:t>
+        <w:tab/>
+        <w:t xml:space="preserve">  </w:t>
+        <w:br/>
+        <w:t>Lab Website:</w:t>
+        <w:tab/>
+        <w:t xml:space="preserve">  </w:t>
       </w:r>
       <w:r>
         <w:rPr>
           <w:sz w:val="22"/>
           <w:szCs w:val="22"/>
         </w:rPr>
-        <w:tab/>
-        <w:t xml:space="preserve"> </w:t>
       </w:r>
       <w:hyperlink r:id="rId13" w:history="1">
         <w:r>
@@ -355,29 +359,24 @@
           <w:sz w:val="22"/>
           <w:szCs w:val="22"/>
         </w:rPr>
-        <w:t xml:space="preserve"> </w:t>
       </w:r>
       <w:r>
         <w:rPr>
           <w:sz w:val="22"/>
           <w:szCs w:val="22"/>
         </w:rPr>
-        <w:br/>
       </w:r>
       <w:r>
         <w:rPr>
           <w:sz w:val="22"/>
           <w:szCs w:val="22"/>
         </w:rPr>
-        <w:t>Lab Website:</w:t>
       </w:r>
       <w:r>
         <w:rPr>
           <w:sz w:val="22"/>
           <w:szCs w:val="22"/>
         </w:rPr>
-        <w:tab/>
-        <w:t xml:space="preserve"> </w:t>
       </w:r>
       <w:hyperlink r:id="rId14" w:history="1">
         <w:r>
@@ -394,7 +393,6 @@
           <w:sz w:val="22"/>
           <w:szCs w:val="22"/>
         </w:rPr>
-        <w:t xml:space="preserve"> </w:t>
       </w:r>
     </w:p>
     <w:p>

</xml_diff>